<commit_message>
Add evidence validation signoff pack
</commit_message>
<xml_diff>
--- a/hospital_ambulance_handover_ba_pack/outputs/00_implementation_proposal_index.docx
+++ b/hospital_ambulance_handover_ba_pack/outputs/00_implementation_proposal_index.docx
@@ -423,6 +423,59 @@
           <w:p>
             <w:r>
               <w:t>Shows benefits realisation and executive reporting</w:t>
+            </w:r>
+          </w:p>
+        </w:tc>
+      </w:tr>
+      <w:tr>
+        <w:tc>
+          <w:tcPr>
+            <w:tcW w:type="dxa" w:w="2880"/>
+            <w:vAlign w:val="center"/>
+            <w:tcMar>
+              <w:top w:w="100" w:type="dxa"/>
+              <w:start w:w="100" w:type="dxa"/>
+              <w:bottom w:w="100" w:type="dxa"/>
+              <w:end w:w="100" w:type="dxa"/>
+            </w:tcMar>
+          </w:tcPr>
+          <w:p>
+            <w:r>
+              <w:t>06 Evidence Validation and Sign-off Pack</w:t>
+            </w:r>
+          </w:p>
+        </w:tc>
+        <w:tc>
+          <w:tcPr>
+            <w:tcW w:type="dxa" w:w="3312"/>
+            <w:vAlign w:val="center"/>
+            <w:tcMar>
+              <w:top w:w="100" w:type="dxa"/>
+              <w:start w:w="100" w:type="dxa"/>
+              <w:bottom w:w="100" w:type="dxa"/>
+              <w:end w:w="100" w:type="dxa"/>
+            </w:tcMar>
+          </w:tcPr>
+          <w:p>
+            <w:r>
+              <w:t>Evidence register, validation checklist, approval templates, and data quality controls</w:t>
+            </w:r>
+          </w:p>
+        </w:tc>
+        <w:tc>
+          <w:tcPr>
+            <w:tcW w:type="dxa" w:w="3888"/>
+            <w:vAlign w:val="center"/>
+            <w:tcMar>
+              <w:top w:w="100" w:type="dxa"/>
+              <w:start w:w="100" w:type="dxa"/>
+              <w:bottom w:w="100" w:type="dxa"/>
+              <w:end w:w="100" w:type="dxa"/>
+            </w:tcMar>
+          </w:tcPr>
+          <w:p>
+            <w:r>
+              <w:t>Shows evidence integrity, governance readiness, and approval pathway</w:t>
             </w:r>
           </w:p>
         </w:tc>

</xml_diff>